<commit_message>
Add IBAN to invoice #2026-08-01
Payment block becomes Bank Details, listing the account holder and the
supplied Spanish IBAN. Checksum verified (mod-97). Regenerated PDF and
DOCX, both still a single A4 page.

Co-Authored-By: Claude Opus 5 <noreply@anthropic.com>
Claude-Session: https://claude.ai/code/session_017kk8d1p66RNmtFgnqdiYbn
</commit_message>
<xml_diff>
--- a/documents/invoices/Invoice_2026-08-01_Serrano_Anson.docx
+++ b/documents/invoices/Invoice_2026-08-01_Serrano_Anson.docx
@@ -1445,23 +1445,196 @@
                 <w:sz w:val="23"/>
                 <w:szCs w:val="23"/>
               </w:rPr>
-              <w:t xml:space="preserve">Payment</w:t>
-            </w:r>
-          </w:p>
-          <w:p>
-            <w:pPr>
-              <w:spacing w:after="150" w:before="0" w:line="280" w:lineRule="auto"/>
-            </w:pPr>
-            <w:r>
-              <w:rPr>
-                <w:rFonts w:ascii="Inter" w:cs="Inter" w:eastAsia="Inter" w:hAnsi="Inter"/>
-                <w:b w:val="false"/>
-                <w:bCs w:val="false"/>
-                <w:color w:val="14150F"/>
-                <w:sz w:val="16"/>
-                <w:szCs w:val="16"/>
-              </w:rPr>
-              <w:t xml:space="preserve">Payment by bank transfer in euro to the account of Jose Luis Serrano Anson.</w:t>
+              <w:t xml:space="preserve">Bank Details</w:t>
+            </w:r>
+          </w:p>
+          <w:tbl>
+            <w:tblPr>
+              <w:tblW w:type="dxa" w:w="3992"/>
+              <w:tblBorders>
+                <w:top w:val="none" w:color="auto" w:sz="0"/>
+                <w:left w:val="none" w:color="auto" w:sz="0"/>
+                <w:bottom w:val="none" w:color="auto" w:sz="0"/>
+                <w:right w:val="none" w:color="auto" w:sz="0"/>
+                <w:insideH w:val="none" w:color="auto" w:sz="0"/>
+                <w:insideV w:val="none" w:color="auto" w:sz="0"/>
+              </w:tblBorders>
+              <w:tblLayout w:type="fixed"/>
+            </w:tblPr>
+            <w:tblGrid>
+              <w:gridCol w:w="1000"/>
+              <w:gridCol w:w="2992"/>
+            </w:tblGrid>
+            <w:tr>
+              <w:tc>
+                <w:tcPr>
+                  <w:tcW w:type="dxa" w:w="1000"/>
+                  <w:tcBorders>
+                    <w:top w:val="none" w:color="auto" w:sz="0"/>
+                    <w:left w:val="none" w:color="auto" w:sz="0"/>
+                    <w:bottom w:val="none" w:color="auto" w:sz="0"/>
+                    <w:right w:val="none" w:color="auto" w:sz="0"/>
+                  </w:tcBorders>
+                  <w:tcMar>
+                    <w:top w:type="dxa" w:w="0"/>
+                    <w:left w:type="dxa" w:w="0"/>
+                    <w:bottom w:type="dxa" w:w="0"/>
+                    <w:right w:type="dxa" w:w="0"/>
+                  </w:tcMar>
+                  <w:vAlign w:val="top"/>
+                </w:tcPr>
+                <w:p>
+                  <w:pPr>
+                    <w:spacing w:after="0" w:before="0" w:line="280" w:lineRule="auto"/>
+                  </w:pPr>
+                  <w:r>
+                    <w:rPr>
+                      <w:rFonts w:ascii="Inter" w:cs="Inter" w:eastAsia="Inter" w:hAnsi="Inter"/>
+                      <w:b w:val="false"/>
+                      <w:bCs w:val="false"/>
+                      <w:color w:val="8C8A82"/>
+                      <w:sz w:val="16"/>
+                      <w:szCs w:val="16"/>
+                    </w:rPr>
+                    <w:t xml:space="preserve">Holder</w:t>
+                  </w:r>
+                </w:p>
+              </w:tc>
+              <w:tc>
+                <w:tcPr>
+                  <w:tcW w:type="dxa" w:w="2992"/>
+                  <w:tcBorders>
+                    <w:top w:val="none" w:color="auto" w:sz="0"/>
+                    <w:left w:val="none" w:color="auto" w:sz="0"/>
+                    <w:bottom w:val="none" w:color="auto" w:sz="0"/>
+                    <w:right w:val="none" w:color="auto" w:sz="0"/>
+                  </w:tcBorders>
+                  <w:tcMar>
+                    <w:top w:type="dxa" w:w="0"/>
+                    <w:left w:type="dxa" w:w="0"/>
+                    <w:bottom w:type="dxa" w:w="0"/>
+                    <w:right w:type="dxa" w:w="0"/>
+                  </w:tcMar>
+                  <w:vAlign w:val="top"/>
+                </w:tcPr>
+                <w:p>
+                  <w:pPr>
+                    <w:spacing w:after="0" w:before="0" w:line="280" w:lineRule="auto"/>
+                  </w:pPr>
+                  <w:r>
+                    <w:rPr>
+                      <w:rFonts w:ascii="Inter" w:cs="Inter" w:eastAsia="Inter" w:hAnsi="Inter"/>
+                      <w:b w:val="false"/>
+                      <w:bCs w:val="false"/>
+                      <w:color w:val="14150F"/>
+                      <w:sz w:val="16"/>
+                      <w:szCs w:val="16"/>
+                    </w:rPr>
+                    <w:t xml:space="preserve">Jose Luis Serrano Anson</w:t>
+                  </w:r>
+                </w:p>
+              </w:tc>
+            </w:tr>
+          </w:tbl>
+          <w:tbl>
+            <w:tblPr>
+              <w:tblW w:type="dxa" w:w="3992"/>
+              <w:tblBorders>
+                <w:top w:val="none" w:color="auto" w:sz="0"/>
+                <w:left w:val="none" w:color="auto" w:sz="0"/>
+                <w:bottom w:val="none" w:color="auto" w:sz="0"/>
+                <w:right w:val="none" w:color="auto" w:sz="0"/>
+                <w:insideH w:val="none" w:color="auto" w:sz="0"/>
+                <w:insideV w:val="none" w:color="auto" w:sz="0"/>
+              </w:tblBorders>
+              <w:tblLayout w:type="fixed"/>
+            </w:tblPr>
+            <w:tblGrid>
+              <w:gridCol w:w="1000"/>
+              <w:gridCol w:w="2992"/>
+            </w:tblGrid>
+            <w:tr>
+              <w:tc>
+                <w:tcPr>
+                  <w:tcW w:type="dxa" w:w="1000"/>
+                  <w:tcBorders>
+                    <w:top w:val="none" w:color="auto" w:sz="0"/>
+                    <w:left w:val="none" w:color="auto" w:sz="0"/>
+                    <w:bottom w:val="none" w:color="auto" w:sz="0"/>
+                    <w:right w:val="none" w:color="auto" w:sz="0"/>
+                  </w:tcBorders>
+                  <w:tcMar>
+                    <w:top w:type="dxa" w:w="0"/>
+                    <w:left w:type="dxa" w:w="0"/>
+                    <w:bottom w:type="dxa" w:w="0"/>
+                    <w:right w:type="dxa" w:w="0"/>
+                  </w:tcMar>
+                  <w:vAlign w:val="top"/>
+                </w:tcPr>
+                <w:p>
+                  <w:pPr>
+                    <w:spacing w:after="0" w:before="0" w:line="280" w:lineRule="auto"/>
+                  </w:pPr>
+                  <w:r>
+                    <w:rPr>
+                      <w:rFonts w:ascii="Inter" w:cs="Inter" w:eastAsia="Inter" w:hAnsi="Inter"/>
+                      <w:b w:val="false"/>
+                      <w:bCs w:val="false"/>
+                      <w:color w:val="8C8A82"/>
+                      <w:sz w:val="16"/>
+                      <w:szCs w:val="16"/>
+                    </w:rPr>
+                    <w:t xml:space="preserve">IBAN</w:t>
+                  </w:r>
+                </w:p>
+              </w:tc>
+              <w:tc>
+                <w:tcPr>
+                  <w:tcW w:type="dxa" w:w="2992"/>
+                  <w:tcBorders>
+                    <w:top w:val="none" w:color="auto" w:sz="0"/>
+                    <w:left w:val="none" w:color="auto" w:sz="0"/>
+                    <w:bottom w:val="none" w:color="auto" w:sz="0"/>
+                    <w:right w:val="none" w:color="auto" w:sz="0"/>
+                  </w:tcBorders>
+                  <w:tcMar>
+                    <w:top w:type="dxa" w:w="0"/>
+                    <w:left w:type="dxa" w:w="0"/>
+                    <w:bottom w:type="dxa" w:w="0"/>
+                    <w:right w:type="dxa" w:w="0"/>
+                  </w:tcMar>
+                  <w:vAlign w:val="top"/>
+                </w:tcPr>
+                <w:p>
+                  <w:pPr>
+                    <w:spacing w:after="0" w:before="0" w:line="280" w:lineRule="auto"/>
+                  </w:pPr>
+                  <w:r>
+                    <w:rPr>
+                      <w:rFonts w:ascii="Inter" w:cs="Inter" w:eastAsia="Inter" w:hAnsi="Inter"/>
+                      <w:b w:val="false"/>
+                      <w:bCs w:val="false"/>
+                      <w:color w:val="14150F"/>
+                      <w:sz w:val="16"/>
+                      <w:szCs w:val="16"/>
+                    </w:rPr>
+                    <w:t xml:space="preserve">ES31 2100 0415 0101 0138 1953</w:t>
+                  </w:r>
+                </w:p>
+              </w:tc>
+            </w:tr>
+          </w:tbl>
+          <w:p>
+            <w:pPr>
+              <w:spacing w:after="170" w:before="0" w:line="20" w:lineRule="exact"/>
+            </w:pPr>
+            <w:r>
+              <w:rPr>
+                <w:rFonts w:ascii="Inter" w:cs="Inter" w:eastAsia="Inter" w:hAnsi="Inter"/>
+                <w:sz w:val="2"/>
+                <w:szCs w:val="2"/>
+              </w:rPr>
+              <w:t xml:space="preserve"/>
             </w:r>
           </w:p>
           <w:p>
@@ -1477,7 +1650,7 @@
                 <w:sz w:val="16"/>
                 <w:szCs w:val="16"/>
               </w:rPr>
-              <w:t xml:space="preserve">Bank details are provided to the client separately.</w:t>
+              <w:t xml:space="preserve">Payment by bank transfer in euro to the account above.</w:t>
             </w:r>
           </w:p>
         </w:tc>

</xml_diff>